<commit_message>
Add Power Planner project with live demo
</commit_message>
<xml_diff>
--- a/Nkosinathi_Msimango_CV.docx
+++ b/Nkosinathi_Msimango_CV.docx
@@ -31,8 +31,97 @@
           <w:sz w:val="18"/>
           <w:szCs w:val="19"/>
         </w:rPr>
-        <w:t>071 368 4922  |  nkosinathimsimangocolin12@gmail.com  |  github.com/Jayday0707-MNC</w:t>
-      </w:r>
+        <w:t xml:space="preserve">071 368 </w:t>
+      </w:r>
+      <w:proofErr w:type="gramStart"/>
+      <w:r>
+        <w:rPr>
+          <w:rFonts w:ascii="Calibri" w:eastAsia="Calibri" w:hAnsi="Calibri" w:cs="Calibri"/>
+          <w:color w:val="555555"/>
+          <w:sz w:val="18"/>
+          <w:szCs w:val="19"/>
+        </w:rPr>
+        <w:t>4922  |</w:t>
+      </w:r>
+      <w:proofErr w:type="gramEnd"/>
+      <w:r>
+        <w:rPr>
+          <w:rFonts w:ascii="Calibri" w:eastAsia="Calibri" w:hAnsi="Calibri" w:cs="Calibri"/>
+          <w:color w:val="555555"/>
+          <w:sz w:val="18"/>
+          <w:szCs w:val="19"/>
+        </w:rPr>
+        <w:t xml:space="preserve">  </w:t>
+      </w:r>
+      <w:proofErr w:type="gramStart"/>
+      <w:r>
+        <w:rPr>
+          <w:rFonts w:ascii="Calibri" w:eastAsia="Calibri" w:hAnsi="Calibri" w:cs="Calibri"/>
+          <w:color w:val="555555"/>
+          <w:sz w:val="18"/>
+          <w:szCs w:val="19"/>
+        </w:rPr>
+        <w:t>nkosinathimsimangocolin12@gmail.com  |</w:t>
+      </w:r>
+      <w:proofErr w:type="gramEnd"/>
+      <w:r>
+        <w:rPr>
+          <w:rFonts w:ascii="Calibri" w:eastAsia="Calibri" w:hAnsi="Calibri" w:cs="Calibri"/>
+          <w:color w:val="555555"/>
+          <w:sz w:val="18"/>
+          <w:szCs w:val="19"/>
+        </w:rPr>
+        <w:t xml:space="preserve">  github.com/Jayday0707-MNC</w:t>
+      </w:r>
+      <w:r>
+        <w:rPr>
+          <w:rFonts w:ascii="Calibri" w:eastAsia="Calibri" w:hAnsi="Calibri" w:cs="Calibri"/>
+          <w:color w:val="555555"/>
+          <w:sz w:val="18"/>
+          <w:szCs w:val="19"/>
+        </w:rPr>
+        <w:t xml:space="preserve"> </w:t>
+      </w:r>
+      <w:r>
+        <w:rPr>
+          <w:rFonts w:ascii="Calibri" w:eastAsia="Calibri" w:hAnsi="Calibri" w:cs="Calibri"/>
+          <w:color w:val="555555"/>
+          <w:sz w:val="18"/>
+          <w:szCs w:val="19"/>
+        </w:rPr>
+        <w:t xml:space="preserve">| </w:t>
+      </w:r>
+      <w:hyperlink r:id="rId5" w:history="1">
+        <w:proofErr w:type="spellStart"/>
+        <w:r>
+          <w:rPr>
+            <w:rStyle w:val="Hyperlink"/>
+            <w:rFonts w:ascii="Calibri" w:eastAsia="Calibri" w:hAnsi="Calibri" w:cs="Calibri"/>
+            <w:sz w:val="18"/>
+            <w:szCs w:val="19"/>
+          </w:rPr>
+          <w:t>webesume</w:t>
+        </w:r>
+        <w:r>
+          <w:rPr>
+            <w:rStyle w:val="Hyperlink"/>
+            <w:rFonts w:ascii="Calibri" w:eastAsia="Calibri" w:hAnsi="Calibri" w:cs="Calibri"/>
+            <w:sz w:val="18"/>
+            <w:szCs w:val="19"/>
+          </w:rPr>
+          <w:t>.</w:t>
+        </w:r>
+        <w:r>
+          <w:rPr>
+            <w:rStyle w:val="Hyperlink"/>
+            <w:rFonts w:ascii="Calibri" w:eastAsia="Calibri" w:hAnsi="Calibri" w:cs="Calibri"/>
+            <w:sz w:val="18"/>
+            <w:szCs w:val="19"/>
+          </w:rPr>
+          <w:t>netlify.app</w:t>
+        </w:r>
+        <w:proofErr w:type="spellEnd"/>
+      </w:hyperlink>
     </w:p>
     <w:p>
       <w:pPr>
@@ -109,7 +198,29 @@
           <w:sz w:val="18"/>
           <w:szCs w:val="19"/>
         </w:rPr>
-        <w:t>Languages &amp; Web: JavaScript, HTML5, CSS3, SQL,Python,</w:t>
+        <w:t xml:space="preserve">Languages &amp; Web: JavaScript, HTML5, CSS3, </w:t>
+      </w:r>
+      <w:proofErr w:type="spellStart"/>
+      <w:proofErr w:type="gramStart"/>
+      <w:r>
+        <w:rPr>
+          <w:rFonts w:ascii="Calibri" w:eastAsia="Calibri" w:hAnsi="Calibri" w:cs="Calibri"/>
+          <w:color w:val="333333"/>
+          <w:sz w:val="18"/>
+          <w:szCs w:val="19"/>
+        </w:rPr>
+        <w:t>SQL,Python</w:t>
+      </w:r>
+      <w:proofErr w:type="spellEnd"/>
+      <w:proofErr w:type="gramEnd"/>
+      <w:r>
+        <w:rPr>
+          <w:rFonts w:ascii="Calibri" w:eastAsia="Calibri" w:hAnsi="Calibri" w:cs="Calibri"/>
+          <w:color w:val="333333"/>
+          <w:sz w:val="18"/>
+          <w:szCs w:val="19"/>
+        </w:rPr>
+        <w:t>,</w:t>
       </w:r>
     </w:p>
     <w:p>
@@ -181,7 +292,27 @@
           <w:sz w:val="18"/>
           <w:szCs w:val="19"/>
         </w:rPr>
-        <w:t>Languages spoken: English, IsiZulu, IsiSwati (fluent)</w:t>
+        <w:t xml:space="preserve">Languages spoken: English, IsiZulu, </w:t>
+      </w:r>
+      <w:proofErr w:type="spellStart"/>
+      <w:r>
+        <w:rPr>
+          <w:rFonts w:ascii="Calibri" w:eastAsia="Calibri" w:hAnsi="Calibri" w:cs="Calibri"/>
+          <w:color w:val="333333"/>
+          <w:sz w:val="18"/>
+          <w:szCs w:val="19"/>
+        </w:rPr>
+        <w:t>IsiSwati</w:t>
+      </w:r>
+      <w:proofErr w:type="spellEnd"/>
+      <w:r>
+        <w:rPr>
+          <w:rFonts w:ascii="Calibri" w:eastAsia="Calibri" w:hAnsi="Calibri" w:cs="Calibri"/>
+          <w:color w:val="333333"/>
+          <w:sz w:val="18"/>
+          <w:szCs w:val="19"/>
+        </w:rPr>
+        <w:t xml:space="preserve"> (fluent)</w:t>
       </w:r>
     </w:p>
     <w:p>
@@ -240,25 +371,56 @@
           <w:iCs/>
           <w:color w:val="555555"/>
         </w:rPr>
-        <w:t>React (Vite), Leaflet, Node.js, Express, PostgreSQL (Neon), JWT, Git/GitHub | Live: mend-ruby.vercel.app</w:t>
-      </w:r>
-    </w:p>
-    <w:p>
-      <w:pPr>
-        <w:pStyle w:val="ListParagraph"/>
-        <w:numPr>
-          <w:ilvl w:val="0"/>
-          <w:numId w:val="1"/>
-        </w:numPr>
-      </w:pPr>
-      <w:r>
-        <w:rPr>
-          <w:rFonts w:ascii="Calibri" w:eastAsia="Calibri" w:hAnsi="Calibri" w:cs="Calibri"/>
-          <w:color w:val="333333"/>
-          <w:sz w:val="18"/>
-          <w:szCs w:val="19"/>
-        </w:rPr>
-        <w:t>Built a map-based platform where residents report water, power and pothole faults and neighbours confirm them, so one problem becomes one report with a public status history.</w:t>
+        <w:t>React (Vite), Leaflet, Node.js, Express, PostgreSQL (Neon), JWT, Git/GitHub | Live: mend-</w:t>
+      </w:r>
+      <w:proofErr w:type="spellStart"/>
+      <w:r>
+        <w:rPr>
+          <w:rFonts w:ascii="Calibri" w:eastAsia="Calibri" w:hAnsi="Calibri" w:cs="Calibri"/>
+          <w:i/>
+          <w:iCs/>
+          <w:color w:val="555555"/>
+        </w:rPr>
+        <w:t>ruby.vercel.app</w:t>
+      </w:r>
+      <w:proofErr w:type="spellEnd"/>
+    </w:p>
+    <w:p>
+      <w:pPr>
+        <w:pStyle w:val="ListParagraph"/>
+        <w:numPr>
+          <w:ilvl w:val="0"/>
+          <w:numId w:val="1"/>
+        </w:numPr>
+      </w:pPr>
+      <w:r>
+        <w:rPr>
+          <w:rFonts w:ascii="Calibri" w:eastAsia="Calibri" w:hAnsi="Calibri" w:cs="Calibri"/>
+          <w:color w:val="333333"/>
+          <w:sz w:val="18"/>
+          <w:szCs w:val="19"/>
+        </w:rPr>
+        <w:t xml:space="preserve">Built a map-based platform where residents report water, power and pothole faults and </w:t>
+      </w:r>
+      <w:proofErr w:type="spellStart"/>
+      <w:r>
+        <w:rPr>
+          <w:rFonts w:ascii="Calibri" w:eastAsia="Calibri" w:hAnsi="Calibri" w:cs="Calibri"/>
+          <w:color w:val="333333"/>
+          <w:sz w:val="18"/>
+          <w:szCs w:val="19"/>
+        </w:rPr>
+        <w:t>neighbours</w:t>
+      </w:r>
+      <w:proofErr w:type="spellEnd"/>
+      <w:r>
+        <w:rPr>
+          <w:rFonts w:ascii="Calibri" w:eastAsia="Calibri" w:hAnsi="Calibri" w:cs="Calibri"/>
+          <w:color w:val="333333"/>
+          <w:sz w:val="18"/>
+          <w:szCs w:val="19"/>
+        </w:rPr>
+        <w:t xml:space="preserve"> confirm them, so one problem becomes one report with a public status history.</w:t>
       </w:r>
     </w:p>
     <w:p>
@@ -316,25 +478,76 @@
           <w:iCs/>
           <w:color w:val="555555"/>
         </w:rPr>
-        <w:t>React (Vite), Node.js, Express, PostgreSQL (Neon), JWT, Git/GitHub | Live: helpdesk-saas.vercel.app</w:t>
-      </w:r>
-    </w:p>
-    <w:p>
-      <w:pPr>
-        <w:pStyle w:val="ListParagraph"/>
-        <w:numPr>
-          <w:ilvl w:val="0"/>
-          <w:numId w:val="1"/>
-        </w:numPr>
-      </w:pPr>
-      <w:r>
-        <w:rPr>
-          <w:rFonts w:ascii="Calibri" w:eastAsia="Calibri" w:hAnsi="Calibri" w:cs="Calibri"/>
-          <w:color w:val="333333"/>
-          <w:sz w:val="18"/>
-          <w:szCs w:val="19"/>
-        </w:rPr>
-        <w:t>Built a multi-tenant helpdesk with private organisation workspaces; every query is scoped to the organisation ID in the user’s token.</w:t>
+        <w:t>React (Vite), Node.js, Express, PostgreSQL (Neon), JWT, Git/GitHub | Live: helpdesk-</w:t>
+      </w:r>
+      <w:proofErr w:type="spellStart"/>
+      <w:r>
+        <w:rPr>
+          <w:rFonts w:ascii="Calibri" w:eastAsia="Calibri" w:hAnsi="Calibri" w:cs="Calibri"/>
+          <w:i/>
+          <w:iCs/>
+          <w:color w:val="555555"/>
+        </w:rPr>
+        <w:t>saas.vercel.app</w:t>
+      </w:r>
+      <w:proofErr w:type="spellEnd"/>
+    </w:p>
+    <w:p>
+      <w:pPr>
+        <w:pStyle w:val="ListParagraph"/>
+        <w:numPr>
+          <w:ilvl w:val="0"/>
+          <w:numId w:val="1"/>
+        </w:numPr>
+      </w:pPr>
+      <w:r>
+        <w:rPr>
+          <w:rFonts w:ascii="Calibri" w:eastAsia="Calibri" w:hAnsi="Calibri" w:cs="Calibri"/>
+          <w:color w:val="333333"/>
+          <w:sz w:val="18"/>
+          <w:szCs w:val="19"/>
+        </w:rPr>
+        <w:t xml:space="preserve">Built a multi-tenant helpdesk with private </w:t>
+      </w:r>
+      <w:proofErr w:type="spellStart"/>
+      <w:r>
+        <w:rPr>
+          <w:rFonts w:ascii="Calibri" w:eastAsia="Calibri" w:hAnsi="Calibri" w:cs="Calibri"/>
+          <w:color w:val="333333"/>
+          <w:sz w:val="18"/>
+          <w:szCs w:val="19"/>
+        </w:rPr>
+        <w:t>organisation</w:t>
+      </w:r>
+      <w:proofErr w:type="spellEnd"/>
+      <w:r>
+        <w:rPr>
+          <w:rFonts w:ascii="Calibri" w:eastAsia="Calibri" w:hAnsi="Calibri" w:cs="Calibri"/>
+          <w:color w:val="333333"/>
+          <w:sz w:val="18"/>
+          <w:szCs w:val="19"/>
+        </w:rPr>
+        <w:t xml:space="preserve"> workspaces; every query is scoped to the </w:t>
+      </w:r>
+      <w:proofErr w:type="spellStart"/>
+      <w:r>
+        <w:rPr>
+          <w:rFonts w:ascii="Calibri" w:eastAsia="Calibri" w:hAnsi="Calibri" w:cs="Calibri"/>
+          <w:color w:val="333333"/>
+          <w:sz w:val="18"/>
+          <w:szCs w:val="19"/>
+        </w:rPr>
+        <w:t>organisation</w:t>
+      </w:r>
+      <w:proofErr w:type="spellEnd"/>
+      <w:r>
+        <w:rPr>
+          <w:rFonts w:ascii="Calibri" w:eastAsia="Calibri" w:hAnsi="Calibri" w:cs="Calibri"/>
+          <w:color w:val="333333"/>
+          <w:sz w:val="18"/>
+          <w:szCs w:val="19"/>
+        </w:rPr>
+        <w:t xml:space="preserve"> ID in the user’s token.</w:t>
       </w:r>
     </w:p>
     <w:p>
@@ -420,6 +633,7 @@
         </w:tabs>
         <w:spacing w:before="40"/>
       </w:pPr>
+      <w:proofErr w:type="spellStart"/>
       <w:r>
         <w:rPr>
           <w:rFonts w:ascii="Calibri" w:eastAsia="Calibri" w:hAnsi="Calibri" w:cs="Calibri"/>
@@ -429,7 +643,19 @@
           <w:sz w:val="22"/>
           <w:szCs w:val="22"/>
         </w:rPr>
-        <w:t>Taskboard — Full-Stack Task Management App</w:t>
+        <w:t>Taskboard</w:t>
+      </w:r>
+      <w:proofErr w:type="spellEnd"/>
+      <w:r>
+        <w:rPr>
+          <w:rFonts w:ascii="Calibri" w:eastAsia="Calibri" w:hAnsi="Calibri" w:cs="Calibri"/>
+          <w:b/>
+          <w:bCs/>
+          <w:color w:val="333333"/>
+          <w:sz w:val="22"/>
+          <w:szCs w:val="22"/>
+        </w:rPr>
+        <w:t xml:space="preserve"> — Full-Stack Task Management App</w:t>
       </w:r>
       <w:r>
         <w:rPr>
@@ -523,16 +749,38 @@
           <w:sz w:val="22"/>
           <w:szCs w:val="22"/>
         </w:rPr>
-        <w:t>WIL Connect — Work-Integrated Learning Placement App</w:t>
-      </w:r>
-      <w:r>
-        <w:rPr>
-          <w:rFonts w:ascii="Calibri" w:eastAsia="Calibri" w:hAnsi="Calibri" w:cs="Calibri"/>
-          <w:color w:val="333333"/>
-          <w:sz w:val="22"/>
-          <w:szCs w:val="22"/>
-        </w:rPr>
-        <w:t xml:space="preserve">  |  Final-Year Project</w:t>
+        <w:t xml:space="preserve">WIL Connect — Work-Integrated Learning Placement </w:t>
+      </w:r>
+      <w:proofErr w:type="gramStart"/>
+      <w:r>
+        <w:rPr>
+          <w:rFonts w:ascii="Calibri" w:eastAsia="Calibri" w:hAnsi="Calibri" w:cs="Calibri"/>
+          <w:b/>
+          <w:bCs/>
+          <w:color w:val="333333"/>
+          <w:sz w:val="22"/>
+          <w:szCs w:val="22"/>
+        </w:rPr>
+        <w:t>App</w:t>
+      </w:r>
+      <w:r>
+        <w:rPr>
+          <w:rFonts w:ascii="Calibri" w:eastAsia="Calibri" w:hAnsi="Calibri" w:cs="Calibri"/>
+          <w:color w:val="333333"/>
+          <w:sz w:val="22"/>
+          <w:szCs w:val="22"/>
+        </w:rPr>
+        <w:t xml:space="preserve">  |</w:t>
+      </w:r>
+      <w:proofErr w:type="gramEnd"/>
+      <w:r>
+        <w:rPr>
+          <w:rFonts w:ascii="Calibri" w:eastAsia="Calibri" w:hAnsi="Calibri" w:cs="Calibri"/>
+          <w:color w:val="333333"/>
+          <w:sz w:val="22"/>
+          <w:szCs w:val="22"/>
+        </w:rPr>
+        <w:t xml:space="preserve">  Final-Year Project</w:t>
       </w:r>
       <w:r>
         <w:rPr>
@@ -607,7 +855,27 @@
           <w:sz w:val="18"/>
           <w:szCs w:val="19"/>
         </w:rPr>
-        <w:t>Currently migrating the UI to React and building out a separate backend service for image and email handling, with deployment planned on Vercel/Netlify.</w:t>
+        <w:t xml:space="preserve">Currently migrating the UI to React and building out a separate backend service for image and email handling, with deployment planned on </w:t>
+      </w:r>
+      <w:proofErr w:type="spellStart"/>
+      <w:r>
+        <w:rPr>
+          <w:rFonts w:ascii="Calibri" w:eastAsia="Calibri" w:hAnsi="Calibri" w:cs="Calibri"/>
+          <w:color w:val="333333"/>
+          <w:sz w:val="18"/>
+          <w:szCs w:val="19"/>
+        </w:rPr>
+        <w:t>Vercel</w:t>
+      </w:r>
+      <w:proofErr w:type="spellEnd"/>
+      <w:r>
+        <w:rPr>
+          <w:rFonts w:ascii="Calibri" w:eastAsia="Calibri" w:hAnsi="Calibri" w:cs="Calibri"/>
+          <w:color w:val="333333"/>
+          <w:sz w:val="18"/>
+          <w:szCs w:val="19"/>
+        </w:rPr>
+        <w:t>/Netlify.</w:t>
       </w:r>
     </w:p>
     <w:p>
@@ -645,16 +913,38 @@
           <w:sz w:val="22"/>
           <w:szCs w:val="22"/>
         </w:rPr>
-        <w:t>Student Mentor &amp; Project Coordinator</w:t>
-      </w:r>
-      <w:r>
-        <w:rPr>
-          <w:rFonts w:ascii="Calibri" w:eastAsia="Calibri" w:hAnsi="Calibri" w:cs="Calibri"/>
-          <w:color w:val="333333"/>
-          <w:sz w:val="22"/>
-          <w:szCs w:val="22"/>
-        </w:rPr>
-        <w:t xml:space="preserve">  |  University of Mpumalanga</w:t>
+        <w:t xml:space="preserve">Student Mentor &amp; Project </w:t>
+      </w:r>
+      <w:proofErr w:type="gramStart"/>
+      <w:r>
+        <w:rPr>
+          <w:rFonts w:ascii="Calibri" w:eastAsia="Calibri" w:hAnsi="Calibri" w:cs="Calibri"/>
+          <w:b/>
+          <w:bCs/>
+          <w:color w:val="333333"/>
+          <w:sz w:val="22"/>
+          <w:szCs w:val="22"/>
+        </w:rPr>
+        <w:t>Coordinator</w:t>
+      </w:r>
+      <w:r>
+        <w:rPr>
+          <w:rFonts w:ascii="Calibri" w:eastAsia="Calibri" w:hAnsi="Calibri" w:cs="Calibri"/>
+          <w:color w:val="333333"/>
+          <w:sz w:val="22"/>
+          <w:szCs w:val="22"/>
+        </w:rPr>
+        <w:t xml:space="preserve">  |</w:t>
+      </w:r>
+      <w:proofErr w:type="gramEnd"/>
+      <w:r>
+        <w:rPr>
+          <w:rFonts w:ascii="Calibri" w:eastAsia="Calibri" w:hAnsi="Calibri" w:cs="Calibri"/>
+          <w:color w:val="333333"/>
+          <w:sz w:val="22"/>
+          <w:szCs w:val="22"/>
+        </w:rPr>
+        <w:t xml:space="preserve">  University of Mpumalanga</w:t>
       </w:r>
       <w:r>
         <w:rPr>
@@ -719,16 +1009,38 @@
           <w:sz w:val="22"/>
           <w:szCs w:val="22"/>
         </w:rPr>
-        <w:t>Staff Member</w:t>
-      </w:r>
-      <w:r>
-        <w:rPr>
-          <w:rFonts w:ascii="Calibri" w:eastAsia="Calibri" w:hAnsi="Calibri" w:cs="Calibri"/>
-          <w:color w:val="333333"/>
-          <w:sz w:val="22"/>
-          <w:szCs w:val="22"/>
-        </w:rPr>
-        <w:t xml:space="preserve">  |  Woolworths Foods</w:t>
+        <w:t xml:space="preserve">Staff </w:t>
+      </w:r>
+      <w:proofErr w:type="gramStart"/>
+      <w:r>
+        <w:rPr>
+          <w:rFonts w:ascii="Calibri" w:eastAsia="Calibri" w:hAnsi="Calibri" w:cs="Calibri"/>
+          <w:b/>
+          <w:bCs/>
+          <w:color w:val="333333"/>
+          <w:sz w:val="22"/>
+          <w:szCs w:val="22"/>
+        </w:rPr>
+        <w:t>Member</w:t>
+      </w:r>
+      <w:r>
+        <w:rPr>
+          <w:rFonts w:ascii="Calibri" w:eastAsia="Calibri" w:hAnsi="Calibri" w:cs="Calibri"/>
+          <w:color w:val="333333"/>
+          <w:sz w:val="22"/>
+          <w:szCs w:val="22"/>
+        </w:rPr>
+        <w:t xml:space="preserve">  |</w:t>
+      </w:r>
+      <w:proofErr w:type="gramEnd"/>
+      <w:r>
+        <w:rPr>
+          <w:rFonts w:ascii="Calibri" w:eastAsia="Calibri" w:hAnsi="Calibri" w:cs="Calibri"/>
+          <w:color w:val="333333"/>
+          <w:sz w:val="22"/>
+          <w:szCs w:val="22"/>
+        </w:rPr>
+        <w:t xml:space="preserve">  Woolworths Foods</w:t>
       </w:r>
       <w:r>
         <w:rPr>
@@ -812,16 +1124,38 @@
           <w:sz w:val="22"/>
           <w:szCs w:val="22"/>
         </w:rPr>
-        <w:t>Bachelor of Information &amp; Communication Technology</w:t>
-      </w:r>
-      <w:r>
-        <w:rPr>
-          <w:rFonts w:ascii="Calibri" w:eastAsia="Calibri" w:hAnsi="Calibri" w:cs="Calibri"/>
-          <w:color w:val="333333"/>
-          <w:sz w:val="22"/>
-          <w:szCs w:val="22"/>
-        </w:rPr>
-        <w:t xml:space="preserve">  |  University of Mpumalanga, Mbombela</w:t>
+        <w:t xml:space="preserve">Bachelor of Information &amp; Communication </w:t>
+      </w:r>
+      <w:proofErr w:type="gramStart"/>
+      <w:r>
+        <w:rPr>
+          <w:rFonts w:ascii="Calibri" w:eastAsia="Calibri" w:hAnsi="Calibri" w:cs="Calibri"/>
+          <w:b/>
+          <w:bCs/>
+          <w:color w:val="333333"/>
+          <w:sz w:val="22"/>
+          <w:szCs w:val="22"/>
+        </w:rPr>
+        <w:t>Technology</w:t>
+      </w:r>
+      <w:r>
+        <w:rPr>
+          <w:rFonts w:ascii="Calibri" w:eastAsia="Calibri" w:hAnsi="Calibri" w:cs="Calibri"/>
+          <w:color w:val="333333"/>
+          <w:sz w:val="22"/>
+          <w:szCs w:val="22"/>
+        </w:rPr>
+        <w:t xml:space="preserve">  |</w:t>
+      </w:r>
+      <w:proofErr w:type="gramEnd"/>
+      <w:r>
+        <w:rPr>
+          <w:rFonts w:ascii="Calibri" w:eastAsia="Calibri" w:hAnsi="Calibri" w:cs="Calibri"/>
+          <w:color w:val="333333"/>
+          <w:sz w:val="22"/>
+          <w:szCs w:val="22"/>
+        </w:rPr>
+        <w:t xml:space="preserve">  University of Mpumalanga, Mbombela</w:t>
       </w:r>
       <w:r>
         <w:rPr>
@@ -859,16 +1193,58 @@
           <w:sz w:val="22"/>
           <w:szCs w:val="22"/>
         </w:rPr>
-        <w:t>National Senior Certificate</w:t>
-      </w:r>
-      <w:r>
-        <w:rPr>
-          <w:rFonts w:ascii="Calibri" w:eastAsia="Calibri" w:hAnsi="Calibri" w:cs="Calibri"/>
-          <w:color w:val="333333"/>
-          <w:sz w:val="22"/>
-          <w:szCs w:val="22"/>
-        </w:rPr>
-        <w:t xml:space="preserve">  |  Methula Secondary School</w:t>
+        <w:t xml:space="preserve">National Senior </w:t>
+      </w:r>
+      <w:proofErr w:type="gramStart"/>
+      <w:r>
+        <w:rPr>
+          <w:rFonts w:ascii="Calibri" w:eastAsia="Calibri" w:hAnsi="Calibri" w:cs="Calibri"/>
+          <w:b/>
+          <w:bCs/>
+          <w:color w:val="333333"/>
+          <w:sz w:val="22"/>
+          <w:szCs w:val="22"/>
+        </w:rPr>
+        <w:t>Certificate</w:t>
+      </w:r>
+      <w:r>
+        <w:rPr>
+          <w:rFonts w:ascii="Calibri" w:eastAsia="Calibri" w:hAnsi="Calibri" w:cs="Calibri"/>
+          <w:color w:val="333333"/>
+          <w:sz w:val="22"/>
+          <w:szCs w:val="22"/>
+        </w:rPr>
+        <w:t xml:space="preserve">  |</w:t>
+      </w:r>
+      <w:proofErr w:type="gramEnd"/>
+      <w:r>
+        <w:rPr>
+          <w:rFonts w:ascii="Calibri" w:eastAsia="Calibri" w:hAnsi="Calibri" w:cs="Calibri"/>
+          <w:color w:val="333333"/>
+          <w:sz w:val="22"/>
+          <w:szCs w:val="22"/>
+        </w:rPr>
+        <w:t xml:space="preserve">  </w:t>
+      </w:r>
+      <w:proofErr w:type="spellStart"/>
+      <w:r>
+        <w:rPr>
+          <w:rFonts w:ascii="Calibri" w:eastAsia="Calibri" w:hAnsi="Calibri" w:cs="Calibri"/>
+          <w:color w:val="333333"/>
+          <w:sz w:val="22"/>
+          <w:szCs w:val="22"/>
+        </w:rPr>
+        <w:t>Methula</w:t>
+      </w:r>
+      <w:proofErr w:type="spellEnd"/>
+      <w:r>
+        <w:rPr>
+          <w:rFonts w:ascii="Calibri" w:eastAsia="Calibri" w:hAnsi="Calibri" w:cs="Calibri"/>
+          <w:color w:val="333333"/>
+          <w:sz w:val="22"/>
+          <w:szCs w:val="22"/>
+        </w:rPr>
+        <w:t xml:space="preserve"> Secondary School</w:t>
       </w:r>
       <w:r>
         <w:rPr>
@@ -915,7 +1291,27 @@
           <w:sz w:val="18"/>
           <w:szCs w:val="19"/>
         </w:rPr>
-        <w:t>Oracle Cloud Infrastructure (OCI) — Mar 2025</w:t>
+        <w:t>Oracle Cloud Infrastructure (</w:t>
+      </w:r>
+      <w:proofErr w:type="gramStart"/>
+      <w:r>
+        <w:rPr>
+          <w:rFonts w:ascii="Calibri" w:eastAsia="Calibri" w:hAnsi="Calibri" w:cs="Calibri"/>
+          <w:color w:val="333333"/>
+          <w:sz w:val="18"/>
+          <w:szCs w:val="19"/>
+        </w:rPr>
+        <w:t>OCI) —</w:t>
+      </w:r>
+      <w:proofErr w:type="gramEnd"/>
+      <w:r>
+        <w:rPr>
+          <w:rFonts w:ascii="Calibri" w:eastAsia="Calibri" w:hAnsi="Calibri" w:cs="Calibri"/>
+          <w:color w:val="333333"/>
+          <w:sz w:val="18"/>
+          <w:szCs w:val="19"/>
+        </w:rPr>
+        <w:t xml:space="preserve"> Mar 2025</w:t>
       </w:r>
     </w:p>
     <w:p>
@@ -1739,6 +2135,30 @@
       <w:szCs w:val="20"/>
     </w:rPr>
   </w:style>
+  <w:style w:type="character" w:styleId="UnresolvedMention">
+    <w:name w:val="Unresolved Mention"/>
+    <w:basedOn w:val="DefaultParagraphFont"/>
+    <w:uiPriority w:val="99"/>
+    <w:semiHidden/>
+    <w:unhideWhenUsed/>
+    <w:rsid w:val="008C4381"/>
+    <w:rPr>
+      <w:color w:val="605E5C"/>
+      <w:shd w:val="clear" w:color="auto" w:fill="E1DFDD"/>
+    </w:rPr>
+  </w:style>
+  <w:style w:type="character" w:styleId="FollowedHyperlink">
+    <w:name w:val="FollowedHyperlink"/>
+    <w:basedOn w:val="DefaultParagraphFont"/>
+    <w:uiPriority w:val="99"/>
+    <w:semiHidden/>
+    <w:unhideWhenUsed/>
+    <w:rsid w:val="008C4381"/>
+    <w:rPr>
+      <w:color w:val="96607D" w:themeColor="followedHyperlink"/>
+      <w:u w:val="single"/>
+    </w:rPr>
+  </w:style>
 </w:styles>
 </file>
 

</xml_diff>